<commit_message>
Seminar 2 certificate: drop certificate number, set duration to 2 hours
Word template only for now; the outdated PDF export is removed.

Co-Authored-By: Claude Opus 5.5 <noreply@anthropic.com>
Claude-Session: https://claude.ai/code/session_018BmcSTSDJm7Z5KPUPDSdGg
</commit_message>
<xml_diff>
--- a/seminar2/Seminar2_Certificate_template.docx
+++ b/seminar2/Seminar2_Certificate_template.docx
@@ -269,22 +269,7 @@
     </w:p>
     <w:p>
       <w:pPr>
-        <w:spacing w:after="0" w:before="260" w:line="468" w:lineRule="exact"/>
-        <w:jc w:val="center"/>
-      </w:pPr>
-      <w:r>
-        <w:rPr>
-          <w:rFonts w:ascii="Poppins Light" w:cs="Poppins Light" w:eastAsia="Poppins Light" w:hAnsi="Poppins Light"/>
-          <w:color w:val="356CA0"/>
-          <w:sz w:val="36"/>
-          <w:szCs w:val="36"/>
-        </w:rPr>
-        <w:t xml:space="preserve">2026/XXXXX</w:t>
-      </w:r>
-    </w:p>
-    <w:p>
-      <w:pPr>
-        <w:spacing w:after="0" w:before="420" w:line="420" w:lineRule="exact"/>
+        <w:spacing w:after="0" w:before="760" w:line="420" w:lineRule="exact"/>
         <w:jc w:val="center"/>
       </w:pPr>
       <w:r>
@@ -314,7 +299,7 @@
     </w:p>
     <w:p>
       <w:pPr>
-        <w:spacing w:after="0" w:before="560" w:line="720" w:lineRule="exact"/>
+        <w:spacing w:after="0" w:before="700" w:line="720" w:lineRule="exact"/>
         <w:jc w:val="center"/>
       </w:pPr>
       <w:r>
@@ -329,7 +314,7 @@
     </w:p>
     <w:p>
       <w:pPr>
-        <w:spacing w:before="0" w:line="1100" w:lineRule="exact"/>
+        <w:spacing w:before="0" w:line="1350" w:lineRule="exact"/>
       </w:pPr>
     </w:p>
     <w:tbl>
@@ -757,7 +742,7 @@
               <w:sz w:val="22"/>
               <w:szCs w:val="22"/>
             </w:rPr>
-            <w:t xml:space="preserve">4 November 2026, 2.5 hours</w:t>
+            <w:t xml:space="preserve">4 November 2026, 2 hours</w:t>
           </w:r>
         </w:p>
       </w:tc>

</xml_diff>